<commit_message>
PRES-06: professional Word styling
templates/reference.docx, made by npm run reference-docx, now sets the
look the owner chose: Calibri body and Georgia headings (installed with
Office), the site's teal on headings, links and table header rows,
bordered tables, US Letter with 1 inch margins, a header with the
document title and "Version x.y.z", and a "Page X of Y" footer. No guide
name or logo. toDocx fills the header's {{title}} (the first heading)
and {{version}} (package.json) in each document. PRD PRES-06 records the
font decision. 1 new test; the pandoc test now checks header, footer and
styles.

Co-Authored-By: Claude Opus 5.5 <noreply@anthropic.com>
</commit_message>
<xml_diff>
--- a/templates/reference.docx
+++ b/templates/reference.docx
@@ -314,9 +314,13 @@
       </w:r>
     </w:p>
     <w:sectPr>
+      <w:headerReference w:type="default" r:id="rIdPres06Header"/>
+      <w:footerReference w:type="default" r:id="rIdPres06Footer"/>
       <w:footnotePr>
         <w:numRestart w:val="eachSect"/>
       </w:footnotePr>
+      <w:pgSz w:w="12240" w:h="15840"/>
+      <w:pgMar w:top="1440" w:right="1440" w:bottom="1440" w:left="1440" w:header="720" w:footer="720" w:gutter="0"/>
     </w:sectPr>
   </w:body>
 </w:document>
@@ -326,6 +330,32 @@
 <w:comments xmlns:w="http://schemas.openxmlformats.org/wordprocessingml/2006/main" xmlns:m="http://schemas.openxmlformats.org/officeDocument/2006/math" xmlns:r="http://schemas.openxmlformats.org/officeDocument/2006/relationships" xmlns:o="urn:schemas-microsoft-com:office:office" xmlns:v="urn:schemas-microsoft-com:vml" xmlns:w10="urn:schemas-microsoft-com:office:word" xmlns:a="http://schemas.openxmlformats.org/drawingml/2006/main" xmlns:pic="http://schemas.openxmlformats.org/drawingml/2006/picture" xmlns:wp="http://schemas.openxmlformats.org/drawingml/2006/wordprocessingDrawing"/>
 </file>
 
+<file path=word/footer1.xml><?xml version="1.0" encoding="utf-8"?>
+<w:ftr xmlns:w="http://schemas.openxmlformats.org/wordprocessingml/2006/main" xmlns:r="http://schemas.openxmlformats.org/officeDocument/2006/relationships">
+  <w:p>
+    <w:pPr>
+      <w:pStyle w:val="Footer"/>
+    </w:pPr>
+    <w:r>
+      <w:t xml:space="preserve">Page </w:t>
+    </w:r>
+    <w:fldSimple w:instr=" PAGE ">
+      <w:r>
+        <w:t xml:space="preserve">1</w:t>
+      </w:r>
+    </w:fldSimple>
+    <w:r>
+      <w:t xml:space="preserve"> of </w:t>
+    </w:r>
+    <w:fldSimple w:instr=" NUMPAGES ">
+      <w:r>
+        <w:t xml:space="preserve">1</w:t>
+      </w:r>
+    </w:fldSimple>
+  </w:p>
+</w:ftr>
+</file>
+
 <file path=word/footnotes.xml><?xml version="1.0" encoding="utf-8"?>
 <w:footnotes xmlns:w="http://schemas.openxmlformats.org/wordprocessingml/2006/main" xmlns:m="http://schemas.openxmlformats.org/officeDocument/2006/math" xmlns:r="http://schemas.openxmlformats.org/officeDocument/2006/relationships" xmlns:o="urn:schemas-microsoft-com:office:office" xmlns:v="urn:schemas-microsoft-com:vml" xmlns:w10="urn:schemas-microsoft-com:office:word" xmlns:a="http://schemas.openxmlformats.org/drawingml/2006/main" xmlns:pic="http://schemas.openxmlformats.org/drawingml/2006/picture" xmlns:wp="http://schemas.openxmlformats.org/drawingml/2006/wordprocessingDrawing">
   <w:footnote w:type="continuationSeparator" w:id="0">
@@ -367,6 +397,25 @@
     </w:p>
   </w:footnote>
 </w:footnotes>
+</file>
+
+<file path=word/header1.xml><?xml version="1.0" encoding="utf-8"?>
+<w:hdr xmlns:w="http://schemas.openxmlformats.org/wordprocessingml/2006/main" xmlns:r="http://schemas.openxmlformats.org/officeDocument/2006/relationships">
+  <w:p>
+    <w:pPr>
+      <w:pStyle w:val="Header"/>
+    </w:pPr>
+    <w:r>
+      <w:t xml:space="preserve">{{title}}</w:t>
+    </w:r>
+    <w:r>
+      <w:tab/>
+    </w:r>
+    <w:r>
+      <w:t xml:space="preserve">Version {{version}}</w:t>
+    </w:r>
+  </w:p>
+</w:hdr>
 </file>
 
 <file path=word/numbering.xml><?xml version="1.0" encoding="utf-8"?>
@@ -485,15 +534,15 @@
   <w:docDefaults>
     <w:rPrDefault>
       <w:rPr>
-        <w:rFonts w:asciiTheme="minorHAnsi" w:eastAsiaTheme="minorEastAsia" w:hAnsiTheme="minorHAnsi" w:cstheme="minorBidi"/>
-        <w:sz w:val="24"/>
-        <w:szCs w:val="24"/>
+        <w:rFonts w:ascii="Calibri" w:hAnsi="Calibri" w:cs="Calibri" w:eastAsiaTheme="minorEastAsia"/>
+        <w:sz w:val="22"/>
+        <w:szCs w:val="22"/>
         <w:lang w:val="en-US" w:eastAsia="zh-CN" w:bidi="ar-SA"/>
       </w:rPr>
     </w:rPrDefault>
     <w:pPrDefault>
       <w:pPr>
-        <w:spacing w:after="200"/>
+        <w:spacing w:after="120" w:line="264" w:lineRule="auto"/>
       </w:pPr>
     </w:pPrDefault>
   </w:docDefaults>
@@ -508,7 +557,7 @@
     <w:link w:val="BodyTextChar"/>
     <w:qFormat/>
     <w:pPr>
-      <w:spacing w:before="180" w:after="180"/>
+      <w:spacing w:before="0" w:after="160"/>
     </w:pPr>
   </w:style>
   <w:style w:type="paragraph" w:customStyle="1" w:styleId="FirstParagraph">
@@ -532,16 +581,15 @@
     <w:link w:val="TitleChar"/>
     <w:uiPriority w:val="10"/>
     <w:qFormat/>
-    <w:rsid w:val="00A10FD9"/>
-    <w:pPr>
-      <w:spacing w:after="80" w:line="240" w:lineRule="auto"/>
+    <w:pPr>
+      <w:spacing w:after="240"/>
       <w:contextualSpacing/>
-      <w:jc w:val="center"/>
-    </w:pPr>
-    <w:rPr>
-      <w:rFonts w:asciiTheme="majorHAnsi" w:eastAsiaTheme="majorEastAsia" w:hAnsiTheme="majorHAnsi" w:cstheme="majorBidi"/>
-      <w:sz w:val="56"/>
-      <w:szCs w:val="56"/>
+    </w:pPr>
+    <w:rPr>
+      <w:rFonts w:ascii="Georgia" w:hAnsi="Georgia" w:cs="Georgia" w:eastAsiaTheme="minorEastAsia"/>
+      <w:color w:val="0F5C5A"/>
+      <w:sz w:val="52"/>
+      <w:szCs w:val="52"/>
     </w:rPr>
   </w:style>
   <w:style w:type="character" w:customStyle="1" w:styleId="TitleChar">
@@ -665,13 +713,198 @@
     <w:link w:val="Heading1Char"/>
     <w:uiPriority w:val="9"/>
     <w:qFormat/>
-    <w:rsid w:val="00A10FD9"/>
     <w:pPr>
       <w:keepNext/>
       <w:keepLines/>
-      <w:spacing w:before="360" w:after="80"/>
+      <w:spacing w:before="360" w:after="120"/>
       <w:outlineLvl w:val="0"/>
     </w:pPr>
+    <w:rPr>
+      <w:rFonts w:ascii="Georgia" w:hAnsi="Georgia" w:cs="Georgia" w:eastAsiaTheme="minorEastAsia"/>
+      <w:color w:val="0F5C5A"/>
+      <w:sz w:val="36"/>
+      <w:szCs w:val="36"/>
+    </w:rPr>
+  </w:style>
+  <w:style w:type="paragraph" w:styleId="Heading2">
+    <w:name w:val="heading 2"/>
+    <w:basedOn w:val="Normal"/>
+    <w:next w:val="BodyText"/>
+    <w:link w:val="Heading2Char"/>
+    <w:uiPriority w:val="9"/>
+    <w:qFormat/>
+    <w:pPr>
+      <w:keepNext/>
+      <w:keepLines/>
+      <w:spacing w:before="300" w:after="100"/>
+      <w:outlineLvl w:val="1"/>
+    </w:pPr>
+    <w:rPr>
+      <w:rFonts w:ascii="Georgia" w:hAnsi="Georgia" w:cs="Georgia" w:eastAsiaTheme="minorEastAsia"/>
+      <w:color w:val="0F5C5A"/>
+      <w:sz w:val="28"/>
+      <w:szCs w:val="28"/>
+    </w:rPr>
+  </w:style>
+  <w:style w:type="paragraph" w:styleId="Heading3">
+    <w:name w:val="heading 3"/>
+    <w:basedOn w:val="Normal"/>
+    <w:next w:val="BodyText"/>
+    <w:link w:val="Heading3Char"/>
+    <w:uiPriority w:val="9"/>
+    <w:qFormat/>
+    <w:pPr>
+      <w:keepNext/>
+      <w:keepLines/>
+      <w:spacing w:before="240" w:after="80"/>
+      <w:outlineLvl w:val="2"/>
+    </w:pPr>
+    <w:rPr>
+      <w:rFonts w:ascii="Georgia" w:hAnsi="Georgia" w:cs="Georgia" w:eastAsiaTheme="minorEastAsia"/>
+      <w:b/>
+      <w:bCs/>
+      <w:color w:val="093A39"/>
+      <w:sz w:val="24"/>
+      <w:szCs w:val="24"/>
+    </w:rPr>
+  </w:style>
+  <w:style w:type="paragraph" w:styleId="Heading4">
+    <w:name w:val="heading 4"/>
+    <w:basedOn w:val="Normal"/>
+    <w:next w:val="BodyText"/>
+    <w:link w:val="Heading4Char"/>
+    <w:uiPriority w:val="9"/>
+    <w:qFormat/>
+    <w:pPr>
+      <w:keepNext/>
+      <w:keepLines/>
+      <w:spacing w:before="200" w:after="60"/>
+      <w:outlineLvl w:val="3"/>
+    </w:pPr>
+    <w:rPr>
+      <w:rFonts w:ascii="Calibri" w:hAnsi="Calibri" w:cs="Calibri" w:eastAsiaTheme="minorEastAsia"/>
+      <w:b/>
+      <w:bCs/>
+      <w:color w:val="093A39"/>
+      <w:sz w:val="22"/>
+      <w:szCs w:val="22"/>
+    </w:rPr>
+  </w:style>
+  <w:style w:type="paragraph" w:styleId="Heading5">
+    <w:name w:val="heading 5"/>
+    <w:basedOn w:val="Normal"/>
+    <w:next w:val="BodyText"/>
+    <w:link w:val="Heading5Char"/>
+    <w:uiPriority w:val="9"/>
+    <w:semiHidden/>
+    <w:unhideWhenUsed/>
+    <w:qFormat/>
+    <w:rsid w:val="00A10FD9"/>
+    <w:pPr>
+      <w:keepNext/>
+      <w:keepLines/>
+      <w:spacing w:before="80" w:after="40"/>
+      <w:outlineLvl w:val="4"/>
+    </w:pPr>
+    <w:rPr>
+      <w:rFonts w:eastAsiaTheme="majorEastAsia" w:cstheme="majorBidi"/>
+      <w:color w:val="0F4761" w:themeColor="accent1" w:themeShade="BF"/>
+    </w:rPr>
+  </w:style>
+  <w:style w:type="paragraph" w:styleId="Heading6">
+    <w:name w:val="heading 6"/>
+    <w:basedOn w:val="Normal"/>
+    <w:next w:val="BodyText"/>
+    <w:link w:val="Heading6Char"/>
+    <w:uiPriority w:val="9"/>
+    <w:semiHidden/>
+    <w:unhideWhenUsed/>
+    <w:qFormat/>
+    <w:rsid w:val="00A10FD9"/>
+    <w:pPr>
+      <w:keepNext/>
+      <w:keepLines/>
+      <w:spacing w:before="40" w:after="0"/>
+      <w:outlineLvl w:val="5"/>
+    </w:pPr>
+    <w:rPr>
+      <w:rFonts w:eastAsiaTheme="majorEastAsia" w:cstheme="majorBidi"/>
+      <w:i/>
+      <w:iCs/>
+      <w:color w:val="595959" w:themeColor="text1" w:themeTint="A6"/>
+    </w:rPr>
+  </w:style>
+  <w:style w:type="paragraph" w:styleId="Heading7">
+    <w:name w:val="heading 7"/>
+    <w:basedOn w:val="Normal"/>
+    <w:next w:val="BodyText"/>
+    <w:link w:val="Heading7Char"/>
+    <w:uiPriority w:val="9"/>
+    <w:semiHidden/>
+    <w:unhideWhenUsed/>
+    <w:qFormat/>
+    <w:rsid w:val="00A10FD9"/>
+    <w:pPr>
+      <w:keepNext/>
+      <w:keepLines/>
+      <w:spacing w:before="40" w:after="0"/>
+      <w:outlineLvl w:val="6"/>
+    </w:pPr>
+    <w:rPr>
+      <w:rFonts w:eastAsiaTheme="majorEastAsia" w:cstheme="majorBidi"/>
+      <w:color w:val="595959" w:themeColor="text1" w:themeTint="A6"/>
+    </w:rPr>
+  </w:style>
+  <w:style w:type="paragraph" w:styleId="Heading8">
+    <w:name w:val="heading 8"/>
+    <w:basedOn w:val="Normal"/>
+    <w:next w:val="BodyText"/>
+    <w:link w:val="Heading8Char"/>
+    <w:uiPriority w:val="9"/>
+    <w:semiHidden/>
+    <w:unhideWhenUsed/>
+    <w:qFormat/>
+    <w:rsid w:val="00A10FD9"/>
+    <w:pPr>
+      <w:keepNext/>
+      <w:keepLines/>
+      <w:spacing w:after="0"/>
+      <w:outlineLvl w:val="7"/>
+    </w:pPr>
+    <w:rPr>
+      <w:rFonts w:eastAsiaTheme="majorEastAsia" w:cstheme="majorBidi"/>
+      <w:i/>
+      <w:iCs/>
+      <w:color w:val="272727" w:themeColor="text1" w:themeTint="D8"/>
+    </w:rPr>
+  </w:style>
+  <w:style w:type="paragraph" w:styleId="Heading9">
+    <w:name w:val="heading 9"/>
+    <w:basedOn w:val="Normal"/>
+    <w:next w:val="BodyText"/>
+    <w:link w:val="Heading9Char"/>
+    <w:uiPriority w:val="9"/>
+    <w:semiHidden/>
+    <w:unhideWhenUsed/>
+    <w:qFormat/>
+    <w:rsid w:val="00A10FD9"/>
+    <w:pPr>
+      <w:keepNext/>
+      <w:keepLines/>
+      <w:spacing w:after="0"/>
+      <w:outlineLvl w:val="8"/>
+    </w:pPr>
+    <w:rPr>
+      <w:rFonts w:eastAsiaTheme="majorEastAsia" w:cstheme="majorBidi"/>
+      <w:color w:val="272727" w:themeColor="text1" w:themeTint="D8"/>
+    </w:rPr>
+  </w:style>
+  <w:style w:type="character" w:customStyle="1" w:styleId="Heading1Char">
+    <w:name w:val="Heading 1 Char"/>
+    <w:basedOn w:val="DefaultParagraphFont"/>
+    <w:link w:val="Heading1"/>
+    <w:uiPriority w:val="9"/>
+    <w:rsid w:val="00A10FD9"/>
     <w:rPr>
       <w:rFonts w:asciiTheme="majorHAnsi" w:eastAsiaTheme="majorEastAsia" w:hAnsiTheme="majorHAnsi" w:cstheme="majorBidi"/>
       <w:color w:val="0F4761" w:themeColor="accent1" w:themeShade="BF"/>
@@ -679,22 +912,13 @@
       <w:szCs w:val="40"/>
     </w:rPr>
   </w:style>
-  <w:style w:type="paragraph" w:styleId="Heading2">
-    <w:name w:val="heading 2"/>
-    <w:basedOn w:val="Normal"/>
-    <w:next w:val="BodyText"/>
-    <w:link w:val="Heading2Char"/>
+  <w:style w:type="character" w:customStyle="1" w:styleId="Heading2Char">
+    <w:name w:val="Heading 2 Char"/>
+    <w:basedOn w:val="DefaultParagraphFont"/>
+    <w:link w:val="Heading2"/>
     <w:uiPriority w:val="9"/>
     <w:semiHidden/>
-    <w:unhideWhenUsed/>
-    <w:qFormat/>
-    <w:rsid w:val="00A10FD9"/>
-    <w:pPr>
-      <w:keepNext/>
-      <w:keepLines/>
-      <w:spacing w:before="160" w:after="80"/>
-      <w:outlineLvl w:val="1"/>
-    </w:pPr>
+    <w:rsid w:val="00A10FD9"/>
     <w:rPr>
       <w:rFonts w:asciiTheme="majorHAnsi" w:eastAsiaTheme="majorEastAsia" w:hAnsiTheme="majorHAnsi" w:cstheme="majorBidi"/>
       <w:color w:val="0F4761" w:themeColor="accent1" w:themeShade="BF"/>
@@ -702,22 +926,13 @@
       <w:szCs w:val="32"/>
     </w:rPr>
   </w:style>
-  <w:style w:type="paragraph" w:styleId="Heading3">
-    <w:name w:val="heading 3"/>
-    <w:basedOn w:val="Normal"/>
-    <w:next w:val="BodyText"/>
-    <w:link w:val="Heading3Char"/>
+  <w:style w:type="character" w:customStyle="1" w:styleId="Heading3Char">
+    <w:name w:val="Heading 3 Char"/>
+    <w:basedOn w:val="DefaultParagraphFont"/>
+    <w:link w:val="Heading3"/>
     <w:uiPriority w:val="9"/>
     <w:semiHidden/>
-    <w:unhideWhenUsed/>
-    <w:qFormat/>
-    <w:rsid w:val="00A10FD9"/>
-    <w:pPr>
-      <w:keepNext/>
-      <w:keepLines/>
-      <w:spacing w:before="160" w:after="80"/>
-      <w:outlineLvl w:val="2"/>
-    </w:pPr>
+    <w:rsid w:val="00A10FD9"/>
     <w:rPr>
       <w:rFonts w:eastAsiaTheme="majorEastAsia" w:cstheme="majorBidi"/>
       <w:color w:val="0F4761" w:themeColor="accent1" w:themeShade="BF"/>
@@ -725,22 +940,13 @@
       <w:szCs w:val="28"/>
     </w:rPr>
   </w:style>
-  <w:style w:type="paragraph" w:styleId="Heading4">
-    <w:name w:val="heading 4"/>
-    <w:basedOn w:val="Normal"/>
-    <w:next w:val="BodyText"/>
-    <w:link w:val="Heading4Char"/>
+  <w:style w:type="character" w:customStyle="1" w:styleId="Heading4Char">
+    <w:name w:val="Heading 4 Char"/>
+    <w:basedOn w:val="DefaultParagraphFont"/>
+    <w:link w:val="Heading4"/>
     <w:uiPriority w:val="9"/>
     <w:semiHidden/>
-    <w:unhideWhenUsed/>
-    <w:qFormat/>
-    <w:rsid w:val="00A10FD9"/>
-    <w:pPr>
-      <w:keepNext/>
-      <w:keepLines/>
-      <w:spacing w:before="80" w:after="40"/>
-      <w:outlineLvl w:val="3"/>
-    </w:pPr>
+    <w:rsid w:val="00A10FD9"/>
     <w:rPr>
       <w:rFonts w:eastAsiaTheme="majorEastAsia" w:cstheme="majorBidi"/>
       <w:i/>
@@ -748,43 +954,25 @@
       <w:color w:val="0F4761" w:themeColor="accent1" w:themeShade="BF"/>
     </w:rPr>
   </w:style>
-  <w:style w:type="paragraph" w:styleId="Heading5">
-    <w:name w:val="heading 5"/>
-    <w:basedOn w:val="Normal"/>
-    <w:next w:val="BodyText"/>
-    <w:link w:val="Heading5Char"/>
+  <w:style w:type="character" w:customStyle="1" w:styleId="Heading5Char">
+    <w:name w:val="Heading 5 Char"/>
+    <w:basedOn w:val="DefaultParagraphFont"/>
+    <w:link w:val="Heading5"/>
     <w:uiPriority w:val="9"/>
     <w:semiHidden/>
-    <w:unhideWhenUsed/>
-    <w:qFormat/>
-    <w:rsid w:val="00A10FD9"/>
-    <w:pPr>
-      <w:keepNext/>
-      <w:keepLines/>
-      <w:spacing w:before="80" w:after="40"/>
-      <w:outlineLvl w:val="4"/>
-    </w:pPr>
+    <w:rsid w:val="00A10FD9"/>
     <w:rPr>
       <w:rFonts w:eastAsiaTheme="majorEastAsia" w:cstheme="majorBidi"/>
       <w:color w:val="0F4761" w:themeColor="accent1" w:themeShade="BF"/>
     </w:rPr>
   </w:style>
-  <w:style w:type="paragraph" w:styleId="Heading6">
-    <w:name w:val="heading 6"/>
-    <w:basedOn w:val="Normal"/>
-    <w:next w:val="BodyText"/>
-    <w:link w:val="Heading6Char"/>
+  <w:style w:type="character" w:customStyle="1" w:styleId="Heading6Char">
+    <w:name w:val="Heading 6 Char"/>
+    <w:basedOn w:val="DefaultParagraphFont"/>
+    <w:link w:val="Heading6"/>
     <w:uiPriority w:val="9"/>
     <w:semiHidden/>
-    <w:unhideWhenUsed/>
-    <w:qFormat/>
-    <w:rsid w:val="00A10FD9"/>
-    <w:pPr>
-      <w:keepNext/>
-      <w:keepLines/>
-      <w:spacing w:before="40" w:after="0"/>
-      <w:outlineLvl w:val="5"/>
-    </w:pPr>
+    <w:rsid w:val="00A10FD9"/>
     <w:rPr>
       <w:rFonts w:eastAsiaTheme="majorEastAsia" w:cstheme="majorBidi"/>
       <w:i/>
@@ -792,43 +980,25 @@
       <w:color w:val="595959" w:themeColor="text1" w:themeTint="A6"/>
     </w:rPr>
   </w:style>
-  <w:style w:type="paragraph" w:styleId="Heading7">
-    <w:name w:val="heading 7"/>
-    <w:basedOn w:val="Normal"/>
-    <w:next w:val="BodyText"/>
-    <w:link w:val="Heading7Char"/>
+  <w:style w:type="character" w:customStyle="1" w:styleId="Heading7Char">
+    <w:name w:val="Heading 7 Char"/>
+    <w:basedOn w:val="DefaultParagraphFont"/>
+    <w:link w:val="Heading7"/>
     <w:uiPriority w:val="9"/>
     <w:semiHidden/>
-    <w:unhideWhenUsed/>
-    <w:qFormat/>
-    <w:rsid w:val="00A10FD9"/>
-    <w:pPr>
-      <w:keepNext/>
-      <w:keepLines/>
-      <w:spacing w:before="40" w:after="0"/>
-      <w:outlineLvl w:val="6"/>
-    </w:pPr>
+    <w:rsid w:val="00A10FD9"/>
     <w:rPr>
       <w:rFonts w:eastAsiaTheme="majorEastAsia" w:cstheme="majorBidi"/>
       <w:color w:val="595959" w:themeColor="text1" w:themeTint="A6"/>
     </w:rPr>
   </w:style>
-  <w:style w:type="paragraph" w:styleId="Heading8">
-    <w:name w:val="heading 8"/>
-    <w:basedOn w:val="Normal"/>
-    <w:next w:val="BodyText"/>
-    <w:link w:val="Heading8Char"/>
+  <w:style w:type="character" w:customStyle="1" w:styleId="Heading8Char">
+    <w:name w:val="Heading 8 Char"/>
+    <w:basedOn w:val="DefaultParagraphFont"/>
+    <w:link w:val="Heading8"/>
     <w:uiPriority w:val="9"/>
     <w:semiHidden/>
-    <w:unhideWhenUsed/>
-    <w:qFormat/>
-    <w:rsid w:val="00A10FD9"/>
-    <w:pPr>
-      <w:keepNext/>
-      <w:keepLines/>
-      <w:spacing w:after="0"/>
-      <w:outlineLvl w:val="7"/>
-    </w:pPr>
+    <w:rsid w:val="00A10FD9"/>
     <w:rPr>
       <w:rFonts w:eastAsiaTheme="majorEastAsia" w:cstheme="majorBidi"/>
       <w:i/>
@@ -836,134 +1006,6 @@
       <w:color w:val="272727" w:themeColor="text1" w:themeTint="D8"/>
     </w:rPr>
   </w:style>
-  <w:style w:type="paragraph" w:styleId="Heading9">
-    <w:name w:val="heading 9"/>
-    <w:basedOn w:val="Normal"/>
-    <w:next w:val="BodyText"/>
-    <w:link w:val="Heading9Char"/>
-    <w:uiPriority w:val="9"/>
-    <w:semiHidden/>
-    <w:unhideWhenUsed/>
-    <w:qFormat/>
-    <w:rsid w:val="00A10FD9"/>
-    <w:pPr>
-      <w:keepNext/>
-      <w:keepLines/>
-      <w:spacing w:after="0"/>
-      <w:outlineLvl w:val="8"/>
-    </w:pPr>
-    <w:rPr>
-      <w:rFonts w:eastAsiaTheme="majorEastAsia" w:cstheme="majorBidi"/>
-      <w:color w:val="272727" w:themeColor="text1" w:themeTint="D8"/>
-    </w:rPr>
-  </w:style>
-  <w:style w:type="character" w:customStyle="1" w:styleId="Heading1Char">
-    <w:name w:val="Heading 1 Char"/>
-    <w:basedOn w:val="DefaultParagraphFont"/>
-    <w:link w:val="Heading1"/>
-    <w:uiPriority w:val="9"/>
-    <w:rsid w:val="00A10FD9"/>
-    <w:rPr>
-      <w:rFonts w:asciiTheme="majorHAnsi" w:eastAsiaTheme="majorEastAsia" w:hAnsiTheme="majorHAnsi" w:cstheme="majorBidi"/>
-      <w:color w:val="0F4761" w:themeColor="accent1" w:themeShade="BF"/>
-      <w:sz w:val="40"/>
-      <w:szCs w:val="40"/>
-    </w:rPr>
-  </w:style>
-  <w:style w:type="character" w:customStyle="1" w:styleId="Heading2Char">
-    <w:name w:val="Heading 2 Char"/>
-    <w:basedOn w:val="DefaultParagraphFont"/>
-    <w:link w:val="Heading2"/>
-    <w:uiPriority w:val="9"/>
-    <w:semiHidden/>
-    <w:rsid w:val="00A10FD9"/>
-    <w:rPr>
-      <w:rFonts w:asciiTheme="majorHAnsi" w:eastAsiaTheme="majorEastAsia" w:hAnsiTheme="majorHAnsi" w:cstheme="majorBidi"/>
-      <w:color w:val="0F4761" w:themeColor="accent1" w:themeShade="BF"/>
-      <w:sz w:val="32"/>
-      <w:szCs w:val="32"/>
-    </w:rPr>
-  </w:style>
-  <w:style w:type="character" w:customStyle="1" w:styleId="Heading3Char">
-    <w:name w:val="Heading 3 Char"/>
-    <w:basedOn w:val="DefaultParagraphFont"/>
-    <w:link w:val="Heading3"/>
-    <w:uiPriority w:val="9"/>
-    <w:semiHidden/>
-    <w:rsid w:val="00A10FD9"/>
-    <w:rPr>
-      <w:rFonts w:eastAsiaTheme="majorEastAsia" w:cstheme="majorBidi"/>
-      <w:color w:val="0F4761" w:themeColor="accent1" w:themeShade="BF"/>
-      <w:sz w:val="28"/>
-      <w:szCs w:val="28"/>
-    </w:rPr>
-  </w:style>
-  <w:style w:type="character" w:customStyle="1" w:styleId="Heading4Char">
-    <w:name w:val="Heading 4 Char"/>
-    <w:basedOn w:val="DefaultParagraphFont"/>
-    <w:link w:val="Heading4"/>
-    <w:uiPriority w:val="9"/>
-    <w:semiHidden/>
-    <w:rsid w:val="00A10FD9"/>
-    <w:rPr>
-      <w:rFonts w:eastAsiaTheme="majorEastAsia" w:cstheme="majorBidi"/>
-      <w:i/>
-      <w:iCs/>
-      <w:color w:val="0F4761" w:themeColor="accent1" w:themeShade="BF"/>
-    </w:rPr>
-  </w:style>
-  <w:style w:type="character" w:customStyle="1" w:styleId="Heading5Char">
-    <w:name w:val="Heading 5 Char"/>
-    <w:basedOn w:val="DefaultParagraphFont"/>
-    <w:link w:val="Heading5"/>
-    <w:uiPriority w:val="9"/>
-    <w:semiHidden/>
-    <w:rsid w:val="00A10FD9"/>
-    <w:rPr>
-      <w:rFonts w:eastAsiaTheme="majorEastAsia" w:cstheme="majorBidi"/>
-      <w:color w:val="0F4761" w:themeColor="accent1" w:themeShade="BF"/>
-    </w:rPr>
-  </w:style>
-  <w:style w:type="character" w:customStyle="1" w:styleId="Heading6Char">
-    <w:name w:val="Heading 6 Char"/>
-    <w:basedOn w:val="DefaultParagraphFont"/>
-    <w:link w:val="Heading6"/>
-    <w:uiPriority w:val="9"/>
-    <w:semiHidden/>
-    <w:rsid w:val="00A10FD9"/>
-    <w:rPr>
-      <w:rFonts w:eastAsiaTheme="majorEastAsia" w:cstheme="majorBidi"/>
-      <w:i/>
-      <w:iCs/>
-      <w:color w:val="595959" w:themeColor="text1" w:themeTint="A6"/>
-    </w:rPr>
-  </w:style>
-  <w:style w:type="character" w:customStyle="1" w:styleId="Heading7Char">
-    <w:name w:val="Heading 7 Char"/>
-    <w:basedOn w:val="DefaultParagraphFont"/>
-    <w:link w:val="Heading7"/>
-    <w:uiPriority w:val="9"/>
-    <w:semiHidden/>
-    <w:rsid w:val="00A10FD9"/>
-    <w:rPr>
-      <w:rFonts w:eastAsiaTheme="majorEastAsia" w:cstheme="majorBidi"/>
-      <w:color w:val="595959" w:themeColor="text1" w:themeTint="A6"/>
-    </w:rPr>
-  </w:style>
-  <w:style w:type="character" w:customStyle="1" w:styleId="Heading8Char">
-    <w:name w:val="Heading 8 Char"/>
-    <w:basedOn w:val="DefaultParagraphFont"/>
-    <w:link w:val="Heading8"/>
-    <w:uiPriority w:val="9"/>
-    <w:semiHidden/>
-    <w:rsid w:val="00A10FD9"/>
-    <w:rPr>
-      <w:rFonts w:eastAsiaTheme="majorEastAsia" w:cstheme="majorBidi"/>
-      <w:i/>
-      <w:iCs/>
-      <w:color w:val="272727" w:themeColor="text1" w:themeTint="D8"/>
-    </w:rPr>
-  </w:style>
   <w:style w:type="character" w:customStyle="1" w:styleId="Heading9Char">
     <w:name w:val="Heading 9 Char"/>
     <w:basedOn w:val="DefaultParagraphFont"/>
@@ -1016,23 +1058,40 @@
   <w:style w:type="table" w:default="1" w:styleId="Table">
     <w:name w:val="Table"/>
     <w:basedOn w:val="TableNormal"/>
-    <w:semiHidden/>
-    <w:unhideWhenUsed/>
-    <w:qFormat/>
+    <w:uiPriority w:val="59"/>
+    <w:qFormat/>
+    <w:pPr>
+      <w:spacing w:before="0" w:after="0"/>
+    </w:pPr>
+    <w:rPr>
+      <w:sz w:val="20"/>
+      <w:szCs w:val="20"/>
+    </w:rPr>
     <w:tblPr>
       <w:tblInd w:w="0" w:type="dxa"/>
+      <w:tblBorders>
+        <w:top w:val="single" w:sz="4" w:space="0" w:color="BFBFBF"/>
+        <w:left w:val="single" w:sz="4" w:space="0" w:color="BFBFBF"/>
+        <w:bottom w:val="single" w:sz="4" w:space="0" w:color="BFBFBF"/>
+        <w:right w:val="single" w:sz="4" w:space="0" w:color="BFBFBF"/>
+        <w:insideH w:val="single" w:sz="4" w:space="0" w:color="BFBFBF"/>
+        <w:insideV w:val="single" w:sz="4" w:space="0" w:color="BFBFBF"/>
+      </w:tblBorders>
       <w:tblCellMar>
-        <w:top w:w="0" w:type="dxa"/>
+        <w:top w:w="60" w:type="dxa"/>
         <w:left w:w="108" w:type="dxa"/>
-        <w:bottom w:w="0" w:type="dxa"/>
+        <w:bottom w:w="60" w:type="dxa"/>
         <w:right w:w="108" w:type="dxa"/>
       </w:tblCellMar>
     </w:tblPr>
     <w:tblStylePr w:type="firstRow">
+      <w:rPr>
+        <w:b/>
+        <w:bCs/>
+        <w:color w:val="FFFFFF"/>
+      </w:rPr>
       <w:tcPr>
-        <w:tcBorders>
-          <w:bottom w:val="single"/>
-        </w:tcBorders>
+        <w:shd w:val="clear" w:color="auto" w:fill="0F5C5A"/>
         <w:vAlign w:val="bottom"/>
       </w:tcPr>
     </w:tblStylePr>
@@ -1115,7 +1174,8 @@
     <w:name w:val="Hyperlink"/>
     <w:basedOn w:val="BodyTextChar"/>
     <w:rPr>
-      <w:color w:val="4F81BD" w:themeColor="accent1"/>
+      <w:color w:val="0F5C5A"/>
+      <w:u w:val="single"/>
     </w:rPr>
   </w:style>
   <w:style w:type="paragraph" w:styleId="TOCHeading">
@@ -1155,6 +1215,41 @@
     </w:pPr>
     <w:rPr>
       <w:i/>
+    </w:rPr>
+  </w:style>
+  <w:style w:type="paragraph" w:styleId="Header">
+    <w:name w:val="header"/>
+    <w:basedOn w:val="Normal"/>
+    <w:uiPriority w:val="99"/>
+    <w:unhideWhenUsed/>
+    <w:pPr>
+      <w:pBdr>
+        <w:bottom w:val="single" w:sz="4" w:space="4" w:color="0F5C5A"/>
+      </w:pBdr>
+      <w:tabs>
+        <w:tab w:val="right" w:pos="9360"/>
+      </w:tabs>
+      <w:spacing w:after="0"/>
+    </w:pPr>
+    <w:rPr>
+      <w:color w:val="595959"/>
+      <w:sz w:val="18"/>
+      <w:szCs w:val="18"/>
+    </w:rPr>
+  </w:style>
+  <w:style w:type="paragraph" w:styleId="Footer">
+    <w:name w:val="footer"/>
+    <w:basedOn w:val="Normal"/>
+    <w:uiPriority w:val="99"/>
+    <w:unhideWhenUsed/>
+    <w:pPr>
+      <w:jc w:val="center"/>
+      <w:spacing w:after="0"/>
+    </w:pPr>
+    <w:rPr>
+      <w:color w:val="595959"/>
+      <w:sz w:val="18"/>
+      <w:szCs w:val="18"/>
     </w:rPr>
   </w:style>
 </w:styles>

</xml_diff>

<commit_message>
PRES-07: Flexoki palette with a blue accent
Owner decision (2026-10-20): replace the teal with the Flexoki palette
from starlight-theme-flexoki, blue accent, on the site and in the Word
styles. theme.css keeps the typefaces only. The favicon, diagrams, social
image, print accent and reference.docx use the same blue. PRD 3.14 adds
PRES-07 and updates the theme, styling and Word styling rows.

Co-Authored-By: Claude Opus 5.5 <noreply@anthropic.com>
</commit_message>
<xml_diff>
--- a/templates/reference.docx
+++ b/templates/reference.docx
@@ -587,7 +587,7 @@
     </w:pPr>
     <w:rPr>
       <w:rFonts w:ascii="Georgia" w:hAnsi="Georgia" w:cs="Georgia" w:eastAsiaTheme="minorEastAsia"/>
-      <w:color w:val="0F5C5A"/>
+      <w:color w:val="1A4F8C"/>
       <w:sz w:val="52"/>
       <w:szCs w:val="52"/>
     </w:rPr>
@@ -721,7 +721,7 @@
     </w:pPr>
     <w:rPr>
       <w:rFonts w:ascii="Georgia" w:hAnsi="Georgia" w:cs="Georgia" w:eastAsiaTheme="minorEastAsia"/>
-      <w:color w:val="0F5C5A"/>
+      <w:color w:val="1A4F8C"/>
       <w:sz w:val="36"/>
       <w:szCs w:val="36"/>
     </w:rPr>
@@ -741,7 +741,7 @@
     </w:pPr>
     <w:rPr>
       <w:rFonts w:ascii="Georgia" w:hAnsi="Georgia" w:cs="Georgia" w:eastAsiaTheme="minorEastAsia"/>
-      <w:color w:val="0F5C5A"/>
+      <w:color w:val="1A4F8C"/>
       <w:sz w:val="28"/>
       <w:szCs w:val="28"/>
     </w:rPr>
@@ -763,7 +763,7 @@
       <w:rFonts w:ascii="Georgia" w:hAnsi="Georgia" w:cs="Georgia" w:eastAsiaTheme="minorEastAsia"/>
       <w:b/>
       <w:bCs/>
-      <w:color w:val="093A39"/>
+      <w:color w:val="163B66"/>
       <w:sz w:val="24"/>
       <w:szCs w:val="24"/>
     </w:rPr>
@@ -785,7 +785,7 @@
       <w:rFonts w:ascii="Calibri" w:hAnsi="Calibri" w:cs="Calibri" w:eastAsiaTheme="minorEastAsia"/>
       <w:b/>
       <w:bCs/>
-      <w:color w:val="093A39"/>
+      <w:color w:val="163B66"/>
       <w:sz w:val="22"/>
       <w:szCs w:val="22"/>
     </w:rPr>
@@ -1091,7 +1091,7 @@
         <w:color w:val="FFFFFF"/>
       </w:rPr>
       <w:tcPr>
-        <w:shd w:val="clear" w:color="auto" w:fill="0F5C5A"/>
+        <w:shd w:val="clear" w:color="auto" w:fill="1A4F8C"/>
         <w:vAlign w:val="bottom"/>
       </w:tcPr>
     </w:tblStylePr>
@@ -1174,7 +1174,7 @@
     <w:name w:val="Hyperlink"/>
     <w:basedOn w:val="BodyTextChar"/>
     <w:rPr>
-      <w:color w:val="0F5C5A"/>
+      <w:color w:val="1A4F8C"/>
       <w:u w:val="single"/>
     </w:rPr>
   </w:style>
@@ -1208,9 +1208,9 @@
     <w:qFormat/>
     <w:pPr>
       <w:pBdr>
-        <w:left w:val="single" w:sz="18" w:space="8" w:color="0F5C5A"/>
+        <w:left w:val="single" w:sz="18" w:space="8" w:color="1A4F8C"/>
       </w:pBdr>
-      <w:shd w:val="clear" w:color="auto" w:fill="EAF4F3"/>
+      <w:shd w:val="clear" w:color="auto" w:fill="E1ECEB"/>
       <w:ind w:left="284"/>
     </w:pPr>
     <w:rPr>
@@ -1224,7 +1224,7 @@
     <w:unhideWhenUsed/>
     <w:pPr>
       <w:pBdr>
-        <w:bottom w:val="single" w:sz="4" w:space="4" w:color="0F5C5A"/>
+        <w:bottom w:val="single" w:sz="4" w:space="4" w:color="1A4F8C"/>
       </w:pBdr>
       <w:tabs>
         <w:tab w:val="right" w:pos="9360"/>

</xml_diff>

<commit_message>
PRES-07: revert to the teal palette
Reverts ca41b92 (#150) at the owner's request: Flexoki's light theme was
harder to read. Records are kept rather than reverted: PRD 3.15 marks
PRES-07 withdrawn and restores the teal rows; the log gains a revert row.

Co-Authored-By: Claude Opus 5.5 <noreply@anthropic.com>
</commit_message>
<xml_diff>
--- a/templates/reference.docx
+++ b/templates/reference.docx
@@ -587,7 +587,7 @@
     </w:pPr>
     <w:rPr>
       <w:rFonts w:ascii="Georgia" w:hAnsi="Georgia" w:cs="Georgia" w:eastAsiaTheme="minorEastAsia"/>
-      <w:color w:val="1A4F8C"/>
+      <w:color w:val="0F5C5A"/>
       <w:sz w:val="52"/>
       <w:szCs w:val="52"/>
     </w:rPr>
@@ -721,7 +721,7 @@
     </w:pPr>
     <w:rPr>
       <w:rFonts w:ascii="Georgia" w:hAnsi="Georgia" w:cs="Georgia" w:eastAsiaTheme="minorEastAsia"/>
-      <w:color w:val="1A4F8C"/>
+      <w:color w:val="0F5C5A"/>
       <w:sz w:val="36"/>
       <w:szCs w:val="36"/>
     </w:rPr>
@@ -741,7 +741,7 @@
     </w:pPr>
     <w:rPr>
       <w:rFonts w:ascii="Georgia" w:hAnsi="Georgia" w:cs="Georgia" w:eastAsiaTheme="minorEastAsia"/>
-      <w:color w:val="1A4F8C"/>
+      <w:color w:val="0F5C5A"/>
       <w:sz w:val="28"/>
       <w:szCs w:val="28"/>
     </w:rPr>
@@ -763,7 +763,7 @@
       <w:rFonts w:ascii="Georgia" w:hAnsi="Georgia" w:cs="Georgia" w:eastAsiaTheme="minorEastAsia"/>
       <w:b/>
       <w:bCs/>
-      <w:color w:val="163B66"/>
+      <w:color w:val="093A39"/>
       <w:sz w:val="24"/>
       <w:szCs w:val="24"/>
     </w:rPr>
@@ -785,7 +785,7 @@
       <w:rFonts w:ascii="Calibri" w:hAnsi="Calibri" w:cs="Calibri" w:eastAsiaTheme="minorEastAsia"/>
       <w:b/>
       <w:bCs/>
-      <w:color w:val="163B66"/>
+      <w:color w:val="093A39"/>
       <w:sz w:val="22"/>
       <w:szCs w:val="22"/>
     </w:rPr>
@@ -1091,7 +1091,7 @@
         <w:color w:val="FFFFFF"/>
       </w:rPr>
       <w:tcPr>
-        <w:shd w:val="clear" w:color="auto" w:fill="1A4F8C"/>
+        <w:shd w:val="clear" w:color="auto" w:fill="0F5C5A"/>
         <w:vAlign w:val="bottom"/>
       </w:tcPr>
     </w:tblStylePr>
@@ -1174,7 +1174,7 @@
     <w:name w:val="Hyperlink"/>
     <w:basedOn w:val="BodyTextChar"/>
     <w:rPr>
-      <w:color w:val="1A4F8C"/>
+      <w:color w:val="0F5C5A"/>
       <w:u w:val="single"/>
     </w:rPr>
   </w:style>
@@ -1208,9 +1208,9 @@
     <w:qFormat/>
     <w:pPr>
       <w:pBdr>
-        <w:left w:val="single" w:sz="18" w:space="8" w:color="1A4F8C"/>
+        <w:left w:val="single" w:sz="18" w:space="8" w:color="0F5C5A"/>
       </w:pBdr>
-      <w:shd w:val="clear" w:color="auto" w:fill="E1ECEB"/>
+      <w:shd w:val="clear" w:color="auto" w:fill="EAF4F3"/>
       <w:ind w:left="284"/>
     </w:pPr>
     <w:rPr>
@@ -1224,7 +1224,7 @@
     <w:unhideWhenUsed/>
     <w:pPr>
       <w:pBdr>
-        <w:bottom w:val="single" w:sz="4" w:space="4" w:color="1A4F8C"/>
+        <w:bottom w:val="single" w:sz="4" w:space="4" w:color="0F5C5A"/>
       </w:pBdr>
       <w:tabs>
         <w:tab w:val="right" w:pos="9360"/>

</xml_diff>